<commit_message>
docs: add Sources & References section to comparison DOCX and PDF
All 8 sources now embedded at the end of both documents including
Gartner Peer Insights, ServiceNow official docs, Plat4mation,
eesel AI, Crossfuze, Redress Compliance, and servistio.

Co-Authored-By: Claude Sonnet 4.6 <noreply@anthropic.com>
</commit_message>
<xml_diff>
--- a/NOW_ASSIST_VS_CUSTOM_BUILT_COMPARISON.docx
+++ b/NOW_ASSIST_VS_CUSTOM_BUILT_COMPARISON.docx
@@ -2429,6 +2429,164 @@
         <w:t>Now Assist wins for pure ServiceNow ITSM use cases where speed and native integration matter. Custom-Built wins everywhere else — multi-system knowledge, branded experiences, full control over prompts/models/evaluation, and any scenario where the client's data lives outside ServiceNow.</w:t>
       </w:r>
     </w:p>
+    <w:p/>
+    <w:p>
+      <w:pPr>
+        <w:spacing w:before="240" w:after="80"/>
+      </w:pPr>
+      <w:r>
+        <w:rPr>
+          <w:b/>
+          <w:color w:val="1B3A6B"/>
+          <w:sz w:val="24"/>
+        </w:rPr>
+        <w:t>Sources &amp; References</w:t>
+      </w:r>
+    </w:p>
+    <w:p>
+      <w:pPr>
+        <w:pStyle w:val="ListNumber"/>
+      </w:pPr>
+      <w:r>
+        <w:rPr>
+          <w:sz w:val="18"/>
+        </w:rPr>
+        <w:t xml:space="preserve">ServiceNow Now Assist — Official Product Page — </w:t>
+      </w:r>
+      <w:r>
+        <w:rPr>
+          <w:color w:val="2E86C1"/>
+          <w:sz w:val="18"/>
+        </w:rPr>
+        <w:t>https://www.servicenow.com/platform/now-assist.html</w:t>
+      </w:r>
+    </w:p>
+    <w:p>
+      <w:pPr>
+        <w:pStyle w:val="ListNumber"/>
+      </w:pPr>
+      <w:r>
+        <w:rPr>
+          <w:sz w:val="18"/>
+        </w:rPr>
+        <w:t xml:space="preserve">Gartner Peer Insights — ServiceNow Now Assist Reviews &amp; Ratings 2026 — </w:t>
+      </w:r>
+      <w:r>
+        <w:rPr>
+          <w:color w:val="2E86C1"/>
+          <w:sz w:val="18"/>
+        </w:rPr>
+        <w:t>https://www.gartner.com/reviews/product/servicenow-now-assist</w:t>
+      </w:r>
+    </w:p>
+    <w:p>
+      <w:pPr>
+        <w:pStyle w:val="ListNumber"/>
+      </w:pPr>
+      <w:r>
+        <w:rPr>
+          <w:sz w:val="18"/>
+        </w:rPr>
+        <w:t xml:space="preserve">Plat4mation — What is ServiceNow Now Assist and why does it matter? — </w:t>
+      </w:r>
+      <w:r>
+        <w:rPr>
+          <w:color w:val="2E86C1"/>
+          <w:sz w:val="18"/>
+        </w:rPr>
+        <w:t>https://plat4mation.com/blog/what-is-servicenow-now-assist-and-why-does-it-matter/</w:t>
+      </w:r>
+    </w:p>
+    <w:p>
+      <w:pPr>
+        <w:pStyle w:val="ListNumber"/>
+      </w:pPr>
+      <w:r>
+        <w:rPr>
+          <w:sz w:val="18"/>
+        </w:rPr>
+        <w:t xml:space="preserve">eesel AI — 6 Best AI tools for ServiceNow in 2026: Complete comparison — </w:t>
+      </w:r>
+      <w:r>
+        <w:rPr>
+          <w:color w:val="2E86C1"/>
+          <w:sz w:val="18"/>
+        </w:rPr>
+        <w:t>https://www.eesel.ai/blog/best-ai-for-servicenow</w:t>
+      </w:r>
+    </w:p>
+    <w:p>
+      <w:pPr>
+        <w:pStyle w:val="ListNumber"/>
+      </w:pPr>
+      <w:r>
+        <w:rPr>
+          <w:sz w:val="18"/>
+        </w:rPr>
+        <w:t xml:space="preserve">Crossfuze — Now Assist FAQs — </w:t>
+      </w:r>
+      <w:r>
+        <w:rPr>
+          <w:color w:val="2E86C1"/>
+          <w:sz w:val="18"/>
+        </w:rPr>
+        <w:t>https://www.crossfuze.com/post/now-assist-faqs</w:t>
+      </w:r>
+    </w:p>
+    <w:p>
+      <w:pPr>
+        <w:pStyle w:val="ListNumber"/>
+      </w:pPr>
+      <w:r>
+        <w:rPr>
+          <w:sz w:val="18"/>
+        </w:rPr>
+        <w:t xml:space="preserve">Redress Compliance — ServiceNow Now Assist Pricing and the ROI Reality — </w:t>
+      </w:r>
+      <w:r>
+        <w:rPr>
+          <w:color w:val="2E86C1"/>
+          <w:sz w:val="18"/>
+        </w:rPr>
+        <w:t>https://redresscompliance.com/servicenow-now-assist-ai-strategy-white-paper.html</w:t>
+      </w:r>
+    </w:p>
+    <w:p>
+      <w:pPr>
+        <w:pStyle w:val="ListNumber"/>
+      </w:pPr>
+      <w:r>
+        <w:rPr>
+          <w:sz w:val="18"/>
+        </w:rPr>
+        <w:t xml:space="preserve">servistio — AI in ServiceNow: Now Assist GenAI vs AI Agents — </w:t>
+      </w:r>
+      <w:r>
+        <w:rPr>
+          <w:color w:val="2E86C1"/>
+          <w:sz w:val="18"/>
+        </w:rPr>
+        <w:t>https://servistio.com/en/blog/ai-in-servicenow-what-is-the-difference-between-now-assist-genai-and-ai-agents/</w:t>
+      </w:r>
+    </w:p>
+    <w:p>
+      <w:pPr>
+        <w:pStyle w:val="ListNumber"/>
+      </w:pPr>
+      <w:r>
+        <w:rPr>
+          <w:sz w:val="18"/>
+        </w:rPr>
+        <w:t xml:space="preserve">ServiceNow Community — Now Assist FAQs — </w:t>
+      </w:r>
+      <w:r>
+        <w:rPr>
+          <w:color w:val="2E86C1"/>
+          <w:sz w:val="18"/>
+        </w:rPr>
+        <w:t>https://www.servicenow.com/community/now-assist-articles/now-assist-faqs/ta-p/2685122</w:t>
+      </w:r>
+    </w:p>
     <w:sectPr>
       <w:pgSz w:w="12240" w:h="15840"/>
       <w:pgMar w:top="1134" w:right="1417" w:bottom="1134" w:left="1417" w:header="720" w:footer="720" w:gutter="0"/>

</xml_diff>